<commit_message>
Update V1 repository references
The instructions for getting the kit pointed to the original repository,
which does not contain the Persona/Color V1. They now point to this fork
(github.com/behrouzeftari/oupi-zumo-sumo) in README, ACTIVITY_RUNBOOK,
INVENTORY (md/docx/pdf), and QUICK_START (docx/pdf, including hyperlink
targets). The PDFs are regenerated from the DOCX files with LibreOffice.

Attribution to the original project by John Hassell / OU
(github.com/jhassell/oupi-zumo-sumo) is kept and made explicit in README,
ACTIVITY_RUNBOOK, and QUICK_START. No robot code changed.

Co-Authored-By: Claude Opus 5.5 <noreply@anthropic.com>
Claude-Session: https://claude.ai/code/session_01SH7RQxQbnz1HLRmjwU349v
</commit_message>
<xml_diff>
--- a/INVENTORY.docx
+++ b/INVENTORY.docx
@@ -1912,7 +1912,7 @@
                 <w:sz w:val="19"/>
                 <w:szCs w:val="19"/>
               </w:rPr>
-              <w:t xml:space="preserve">Print QUICK_START.pdf and note github.com/jhassell/oupi-zumo-sumo, so anyone can set up from scratch.</w:t>
+              <w:t xml:space="preserve">Print QUICK_START.pdf and note github.com/behrouzeftari/oupi-zumo-sumo, so anyone can set up from scratch.</w:t>
             </w:r>
           </w:p>
         </w:tc>
@@ -2171,7 +2171,7 @@
             <w:sz w:val="18"/>
             <w:szCs w:val="18"/>
           </w:rPr>
-          <w:t xml:space="preserve">https://github.com/jhassell/oupi-zumo-sumo</w:t>
+          <w:t xml:space="preserve">https://github.com/behrouzeftari/oupi-zumo-sumo</w:t>
         </w:r>
       </w:hyperlink>
       <w:r>

</xml_diff>